<commit_message>
Clean and rename requirements files
</commit_message>
<xml_diff>
--- a/Requirements/Project Requirements.docx
+++ b/Requirements/Project Requirements.docx
@@ -94,10 +94,8 @@
     </w:p>
     <w:tbl>
       <w:tblPr>
-        <w:tblW w:type="dxa" w:w="8306"/>
-        <w:tblLayout w:type="fixed"/>
-        <w:tblLook w:firstColumn="1" w:firstRow="1" w:lastColumn="0" w:lastRow="0" w:noHBand="0" w:noVBand="1" w:val="04A0"/>
-        <w:jc w:val="left"/>
+        <w:tblW w:w="8306" w:type="dxa"/>
+        <w:tblInd w:w="120" w:type="dxa"/>
         <w:tblBorders>
           <w:top w:val="single" w:sz="4" w:space="0" w:color="A6A6A6"/>
           <w:left w:val="single" w:sz="4" w:space="0" w:color="A6A6A6"/>
@@ -106,7 +104,8 @@
           <w:insideH w:val="single" w:sz="4" w:space="0" w:color="A6A6A6"/>
           <w:insideV w:val="single" w:sz="4" w:space="0" w:color="A6A6A6"/>
         </w:tblBorders>
-        <w:tblInd w:type="dxa" w:w="120"/>
+        <w:tblLayout w:type="fixed"/>
+        <w:tblLook w:val="04A0" w:firstRow="1" w:lastRow="0" w:firstColumn="1" w:lastColumn="0" w:noHBand="0" w:noVBand="1"/>
       </w:tblPr>
       <w:tblGrid>
         <w:gridCol w:w="914"/>
@@ -116,25 +115,24 @@
       </w:tblGrid>
       <w:tr>
         <w:trPr>
-          <w:tblHeader w:val="true"/>
+          <w:tblHeader/>
         </w:trPr>
         <w:tc>
           <w:tcPr>
-            <w:tcW w:type="dxa" w:w="914"/>
-            <w:shd w:fill="1F4E78"/>
-            <w:vAlign w:val="center"/>
-            <w:tcMar>
-              <w:top w:w="80" w:type="dxa"/>
-              <w:bottom w:w="80" w:type="dxa"/>
-              <w:start w:w="120" w:type="dxa"/>
-              <w:end w:w="120" w:type="dxa"/>
-            </w:tcMar>
-          </w:tcPr>
-          <w:p>
-            <w:pPr>
-              <w:spacing w:before="0" w:after="40" w:line="240" w:lineRule="auto"/>
-            </w:pPr>
-            <w:r/>
+            <w:tcW w:w="914" w:type="dxa"/>
+            <w:shd w:val="clear" w:color="auto" w:fill="1F4E78"/>
+            <w:tcMar>
+              <w:top w:w="80" w:type="dxa"/>
+              <w:left w:w="120" w:type="dxa"/>
+              <w:bottom w:w="80" w:type="dxa"/>
+              <w:right w:w="120" w:type="dxa"/>
+            </w:tcMar>
+            <w:vAlign w:val="center"/>
+          </w:tcPr>
+          <w:p>
+            <w:pPr>
+              <w:spacing w:after="40" w:line="240" w:lineRule="auto"/>
+            </w:pPr>
             <w:r>
               <w:rPr>
                 <w:rFonts w:ascii="Calibri" w:hAnsi="Calibri"/>
@@ -148,21 +146,20 @@
         </w:tc>
         <w:tc>
           <w:tcPr>
-            <w:tcW w:type="dxa" w:w="2409"/>
-            <w:shd w:fill="1F4E78"/>
-            <w:vAlign w:val="center"/>
-            <w:tcMar>
-              <w:top w:w="80" w:type="dxa"/>
-              <w:bottom w:w="80" w:type="dxa"/>
-              <w:start w:w="120" w:type="dxa"/>
-              <w:end w:w="120" w:type="dxa"/>
-            </w:tcMar>
-          </w:tcPr>
-          <w:p>
-            <w:pPr>
-              <w:spacing w:before="0" w:after="40" w:line="240" w:lineRule="auto"/>
-            </w:pPr>
-            <w:r/>
+            <w:tcW w:w="2409" w:type="dxa"/>
+            <w:shd w:val="clear" w:color="auto" w:fill="1F4E78"/>
+            <w:tcMar>
+              <w:top w:w="80" w:type="dxa"/>
+              <w:left w:w="120" w:type="dxa"/>
+              <w:bottom w:w="80" w:type="dxa"/>
+              <w:right w:w="120" w:type="dxa"/>
+            </w:tcMar>
+            <w:vAlign w:val="center"/>
+          </w:tcPr>
+          <w:p>
+            <w:pPr>
+              <w:spacing w:after="40" w:line="240" w:lineRule="auto"/>
+            </w:pPr>
             <w:r>
               <w:rPr>
                 <w:rFonts w:ascii="Calibri" w:hAnsi="Calibri"/>
@@ -176,21 +173,20 @@
         </w:tc>
         <w:tc>
           <w:tcPr>
-            <w:tcW w:type="dxa" w:w="2575"/>
-            <w:shd w:fill="1F4E78"/>
-            <w:vAlign w:val="center"/>
-            <w:tcMar>
-              <w:top w:w="80" w:type="dxa"/>
-              <w:bottom w:w="80" w:type="dxa"/>
-              <w:start w:w="120" w:type="dxa"/>
-              <w:end w:w="120" w:type="dxa"/>
-            </w:tcMar>
-          </w:tcPr>
-          <w:p>
-            <w:pPr>
-              <w:spacing w:before="0" w:after="40" w:line="240" w:lineRule="auto"/>
-            </w:pPr>
-            <w:r/>
+            <w:tcW w:w="2575" w:type="dxa"/>
+            <w:shd w:val="clear" w:color="auto" w:fill="1F4E78"/>
+            <w:tcMar>
+              <w:top w:w="80" w:type="dxa"/>
+              <w:left w:w="120" w:type="dxa"/>
+              <w:bottom w:w="80" w:type="dxa"/>
+              <w:right w:w="120" w:type="dxa"/>
+            </w:tcMar>
+            <w:vAlign w:val="center"/>
+          </w:tcPr>
+          <w:p>
+            <w:pPr>
+              <w:spacing w:after="40" w:line="240" w:lineRule="auto"/>
+            </w:pPr>
             <w:r>
               <w:rPr>
                 <w:rFonts w:ascii="Calibri" w:hAnsi="Calibri"/>
@@ -204,21 +200,20 @@
         </w:tc>
         <w:tc>
           <w:tcPr>
-            <w:tcW w:type="dxa" w:w="2408"/>
-            <w:shd w:fill="1F4E78"/>
-            <w:vAlign w:val="center"/>
-            <w:tcMar>
-              <w:top w:w="80" w:type="dxa"/>
-              <w:bottom w:w="80" w:type="dxa"/>
-              <w:start w:w="120" w:type="dxa"/>
-              <w:end w:w="120" w:type="dxa"/>
-            </w:tcMar>
-          </w:tcPr>
-          <w:p>
-            <w:pPr>
-              <w:spacing w:before="0" w:after="40" w:line="240" w:lineRule="auto"/>
-            </w:pPr>
-            <w:r/>
+            <w:tcW w:w="2408" w:type="dxa"/>
+            <w:shd w:val="clear" w:color="auto" w:fill="1F4E78"/>
+            <w:tcMar>
+              <w:top w:w="80" w:type="dxa"/>
+              <w:left w:w="120" w:type="dxa"/>
+              <w:bottom w:w="80" w:type="dxa"/>
+              <w:right w:w="120" w:type="dxa"/>
+            </w:tcMar>
+            <w:vAlign w:val="center"/>
+          </w:tcPr>
+          <w:p>
+            <w:pPr>
+              <w:spacing w:after="40" w:line="240" w:lineRule="auto"/>
+            </w:pPr>
             <w:r>
               <w:rPr>
                 <w:rFonts w:ascii="Calibri" w:hAnsi="Calibri"/>
@@ -232,23 +227,21 @@
         </w:tc>
       </w:tr>
       <w:tr>
-        <w:trPr/>
-        <w:tc>
-          <w:tcPr>
-            <w:tcW w:type="dxa" w:w="914"/>
-            <w:vAlign w:val="center"/>
-            <w:tcMar>
-              <w:top w:w="80" w:type="dxa"/>
-              <w:bottom w:w="80" w:type="dxa"/>
-              <w:start w:w="120" w:type="dxa"/>
-              <w:end w:w="120" w:type="dxa"/>
-            </w:tcMar>
-          </w:tcPr>
-          <w:p>
-            <w:pPr>
-              <w:spacing w:before="0" w:after="40" w:line="240" w:lineRule="auto"/>
-            </w:pPr>
-            <w:r/>
+        <w:tc>
+          <w:tcPr>
+            <w:tcW w:w="914" w:type="dxa"/>
+            <w:tcMar>
+              <w:top w:w="80" w:type="dxa"/>
+              <w:left w:w="120" w:type="dxa"/>
+              <w:bottom w:w="80" w:type="dxa"/>
+              <w:right w:w="120" w:type="dxa"/>
+            </w:tcMar>
+            <w:vAlign w:val="center"/>
+          </w:tcPr>
+          <w:p>
+            <w:pPr>
+              <w:spacing w:after="40" w:line="240" w:lineRule="auto"/>
+            </w:pPr>
             <w:r>
               <w:rPr>
                 <w:rFonts w:ascii="Calibri" w:hAnsi="Calibri"/>
@@ -261,24 +254,22 @@
         </w:tc>
         <w:tc>
           <w:tcPr>
-            <w:tcW w:type="dxa" w:w="2409"/>
-            <w:vAlign w:val="center"/>
-            <w:tcMar>
-              <w:top w:w="80" w:type="dxa"/>
-              <w:bottom w:w="80" w:type="dxa"/>
-              <w:start w:w="120" w:type="dxa"/>
-              <w:end w:w="120" w:type="dxa"/>
-            </w:tcMar>
-          </w:tcPr>
-          <w:p>
-            <w:pPr>
-              <w:spacing w:before="0" w:after="40" w:line="240" w:lineRule="auto"/>
-            </w:pPr>
-            <w:r/>
-            <w:r>
-              <w:rPr>
-                <w:rFonts w:ascii="Calibri" w:hAnsi="Calibri"/>
-                <w:b w:val="0"/>
+            <w:tcW w:w="2409" w:type="dxa"/>
+            <w:tcMar>
+              <w:top w:w="80" w:type="dxa"/>
+              <w:left w:w="120" w:type="dxa"/>
+              <w:bottom w:w="80" w:type="dxa"/>
+              <w:right w:w="120" w:type="dxa"/>
+            </w:tcMar>
+            <w:vAlign w:val="center"/>
+          </w:tcPr>
+          <w:p>
+            <w:pPr>
+              <w:spacing w:after="40" w:line="240" w:lineRule="auto"/>
+            </w:pPr>
+            <w:r>
+              <w:rPr>
+                <w:rFonts w:ascii="Calibri" w:hAnsi="Calibri"/>
                 <w:sz w:val="17"/>
               </w:rPr>
               <w:t>The motor plate shall interface with the simplified NEMA 17-style CAD model.</w:t>
@@ -287,24 +278,22 @@
         </w:tc>
         <w:tc>
           <w:tcPr>
-            <w:tcW w:type="dxa" w:w="2575"/>
-            <w:vAlign w:val="center"/>
-            <w:tcMar>
-              <w:top w:w="80" w:type="dxa"/>
-              <w:bottom w:w="80" w:type="dxa"/>
-              <w:start w:w="120" w:type="dxa"/>
-              <w:end w:w="120" w:type="dxa"/>
-            </w:tcMar>
-          </w:tcPr>
-          <w:p>
-            <w:pPr>
-              <w:spacing w:before="0" w:after="40" w:line="240" w:lineRule="auto"/>
-            </w:pPr>
-            <w:r/>
-            <w:r>
-              <w:rPr>
-                <w:rFonts w:ascii="Calibri" w:hAnsi="Calibri"/>
-                <w:b w:val="0"/>
+            <w:tcW w:w="2575" w:type="dxa"/>
+            <w:tcMar>
+              <w:top w:w="80" w:type="dxa"/>
+              <w:left w:w="120" w:type="dxa"/>
+              <w:bottom w:w="80" w:type="dxa"/>
+              <w:right w:w="120" w:type="dxa"/>
+            </w:tcMar>
+            <w:vAlign w:val="center"/>
+          </w:tcPr>
+          <w:p>
+            <w:pPr>
+              <w:spacing w:after="40" w:line="240" w:lineRule="auto"/>
+            </w:pPr>
+            <w:r>
+              <w:rPr>
+                <w:rFonts w:ascii="Calibri" w:hAnsi="Calibri"/>
                 <w:sz w:val="17"/>
               </w:rPr>
               <w:t>The 40 x 40 mm motor body is only a simplified CAD representation, not a verified commercial NEMA 17 envelope. The mounting interface uses four M3 holes on a 31 x 31 mm pattern. Final fit with a specific real motor requires verification.</w:t>
@@ -313,24 +302,22 @@
         </w:tc>
         <w:tc>
           <w:tcPr>
-            <w:tcW w:type="dxa" w:w="2408"/>
-            <w:vAlign w:val="center"/>
-            <w:tcMar>
-              <w:top w:w="80" w:type="dxa"/>
-              <w:bottom w:w="80" w:type="dxa"/>
-              <w:start w:w="120" w:type="dxa"/>
-              <w:end w:w="120" w:type="dxa"/>
-            </w:tcMar>
-          </w:tcPr>
-          <w:p>
-            <w:pPr>
-              <w:spacing w:before="0" w:after="40" w:line="240" w:lineRule="auto"/>
-            </w:pPr>
-            <w:r/>
-            <w:r>
-              <w:rPr>
-                <w:rFonts w:ascii="Calibri" w:hAnsi="Calibri"/>
-                <w:b w:val="0"/>
+            <w:tcW w:w="2408" w:type="dxa"/>
+            <w:tcMar>
+              <w:top w:w="80" w:type="dxa"/>
+              <w:left w:w="120" w:type="dxa"/>
+              <w:bottom w:w="80" w:type="dxa"/>
+              <w:right w:w="120" w:type="dxa"/>
+            </w:tcMar>
+            <w:vAlign w:val="center"/>
+          </w:tcPr>
+          <w:p>
+            <w:pPr>
+              <w:spacing w:after="40" w:line="240" w:lineRule="auto"/>
+            </w:pPr>
+            <w:r>
+              <w:rPr>
+                <w:rFonts w:ascii="Calibri" w:hAnsi="Calibri"/>
                 <w:sz w:val="17"/>
               </w:rPr>
               <w:t>Check the CAD assembly and mounting-hole alignment. Before manufacture, compare the drawing against the selected motor's datasheet and perform a physical fit check.</w:t>
@@ -339,24 +326,22 @@
         </w:tc>
       </w:tr>
       <w:tr>
-        <w:trPr/>
-        <w:tc>
-          <w:tcPr>
-            <w:tcW w:type="dxa" w:w="914"/>
-            <w:vAlign w:val="center"/>
-            <w:shd w:fill="EAF2F8"/>
-            <w:tcMar>
-              <w:top w:w="80" w:type="dxa"/>
-              <w:bottom w:w="80" w:type="dxa"/>
-              <w:start w:w="120" w:type="dxa"/>
-              <w:end w:w="120" w:type="dxa"/>
-            </w:tcMar>
-          </w:tcPr>
-          <w:p>
-            <w:pPr>
-              <w:spacing w:before="0" w:after="40" w:line="240" w:lineRule="auto"/>
-            </w:pPr>
-            <w:r/>
+        <w:tc>
+          <w:tcPr>
+            <w:tcW w:w="914" w:type="dxa"/>
+            <w:shd w:val="clear" w:color="auto" w:fill="EAF2F8"/>
+            <w:tcMar>
+              <w:top w:w="80" w:type="dxa"/>
+              <w:left w:w="120" w:type="dxa"/>
+              <w:bottom w:w="80" w:type="dxa"/>
+              <w:right w:w="120" w:type="dxa"/>
+            </w:tcMar>
+            <w:vAlign w:val="center"/>
+          </w:tcPr>
+          <w:p>
+            <w:pPr>
+              <w:spacing w:after="40" w:line="240" w:lineRule="auto"/>
+            </w:pPr>
             <w:r>
               <w:rPr>
                 <w:rFonts w:ascii="Calibri" w:hAnsi="Calibri"/>
@@ -369,25 +354,23 @@
         </w:tc>
         <w:tc>
           <w:tcPr>
-            <w:tcW w:type="dxa" w:w="2409"/>
-            <w:vAlign w:val="center"/>
-            <w:shd w:fill="EAF2F8"/>
-            <w:tcMar>
-              <w:top w:w="80" w:type="dxa"/>
-              <w:bottom w:w="80" w:type="dxa"/>
-              <w:start w:w="120" w:type="dxa"/>
-              <w:end w:w="120" w:type="dxa"/>
-            </w:tcMar>
-          </w:tcPr>
-          <w:p>
-            <w:pPr>
-              <w:spacing w:before="0" w:after="40" w:line="240" w:lineRule="auto"/>
-            </w:pPr>
-            <w:r/>
-            <w:r>
-              <w:rPr>
-                <w:rFonts w:ascii="Calibri" w:hAnsi="Calibri"/>
-                <w:b w:val="0"/>
+            <w:tcW w:w="2409" w:type="dxa"/>
+            <w:shd w:val="clear" w:color="auto" w:fill="EAF2F8"/>
+            <w:tcMar>
+              <w:top w:w="80" w:type="dxa"/>
+              <w:left w:w="120" w:type="dxa"/>
+              <w:bottom w:w="80" w:type="dxa"/>
+              <w:right w:w="120" w:type="dxa"/>
+            </w:tcMar>
+            <w:vAlign w:val="center"/>
+          </w:tcPr>
+          <w:p>
+            <w:pPr>
+              <w:spacing w:after="40" w:line="240" w:lineRule="auto"/>
+            </w:pPr>
+            <w:r>
+              <w:rPr>
+                <w:rFonts w:ascii="Calibri" w:hAnsi="Calibri"/>
                 <w:sz w:val="17"/>
               </w:rPr>
               <w:t>The motor plate shall retain the current compact geometry.</w:t>
@@ -396,25 +379,23 @@
         </w:tc>
         <w:tc>
           <w:tcPr>
-            <w:tcW w:type="dxa" w:w="2575"/>
-            <w:vAlign w:val="center"/>
-            <w:shd w:fill="EAF2F8"/>
-            <w:tcMar>
-              <w:top w:w="80" w:type="dxa"/>
-              <w:bottom w:w="80" w:type="dxa"/>
-              <w:start w:w="120" w:type="dxa"/>
-              <w:end w:w="120" w:type="dxa"/>
-            </w:tcMar>
-          </w:tcPr>
-          <w:p>
-            <w:pPr>
-              <w:spacing w:before="0" w:after="40" w:line="240" w:lineRule="auto"/>
-            </w:pPr>
-            <w:r/>
-            <w:r>
-              <w:rPr>
-                <w:rFonts w:ascii="Calibri" w:hAnsi="Calibri"/>
-                <w:b w:val="0"/>
+            <w:tcW w:w="2575" w:type="dxa"/>
+            <w:shd w:val="clear" w:color="auto" w:fill="EAF2F8"/>
+            <w:tcMar>
+              <w:top w:w="80" w:type="dxa"/>
+              <w:left w:w="120" w:type="dxa"/>
+              <w:bottom w:w="80" w:type="dxa"/>
+              <w:right w:w="120" w:type="dxa"/>
+            </w:tcMar>
+            <w:vAlign w:val="center"/>
+          </w:tcPr>
+          <w:p>
+            <w:pPr>
+              <w:spacing w:after="40" w:line="240" w:lineRule="auto"/>
+            </w:pPr>
+            <w:r>
+              <w:rPr>
+                <w:rFonts w:ascii="Calibri" w:hAnsi="Calibri"/>
                 <w:sz w:val="17"/>
               </w:rPr>
               <w:t>70 x 70 x 5 mm nominal.</w:t>
@@ -423,25 +404,23 @@
         </w:tc>
         <w:tc>
           <w:tcPr>
-            <w:tcW w:type="dxa" w:w="2408"/>
-            <w:vAlign w:val="center"/>
-            <w:shd w:fill="EAF2F8"/>
-            <w:tcMar>
-              <w:top w:w="80" w:type="dxa"/>
-              <w:bottom w:w="80" w:type="dxa"/>
-              <w:start w:w="120" w:type="dxa"/>
-              <w:end w:w="120" w:type="dxa"/>
-            </w:tcMar>
-          </w:tcPr>
-          <w:p>
-            <w:pPr>
-              <w:spacing w:before="0" w:after="40" w:line="240" w:lineRule="auto"/>
-            </w:pPr>
-            <w:r/>
-            <w:r>
-              <w:rPr>
-                <w:rFonts w:ascii="Calibri" w:hAnsi="Calibri"/>
-                <w:b w:val="0"/>
+            <w:tcW w:w="2408" w:type="dxa"/>
+            <w:shd w:val="clear" w:color="auto" w:fill="EAF2F8"/>
+            <w:tcMar>
+              <w:top w:w="80" w:type="dxa"/>
+              <w:left w:w="120" w:type="dxa"/>
+              <w:bottom w:w="80" w:type="dxa"/>
+              <w:right w:w="120" w:type="dxa"/>
+            </w:tcMar>
+            <w:vAlign w:val="center"/>
+          </w:tcPr>
+          <w:p>
+            <w:pPr>
+              <w:spacing w:after="40" w:line="240" w:lineRule="auto"/>
+            </w:pPr>
+            <w:r>
+              <w:rPr>
+                <w:rFonts w:ascii="Calibri" w:hAnsi="Calibri"/>
                 <w:sz w:val="17"/>
               </w:rPr>
               <w:t>Measure the CAD model or inspect the released drawing.</w:t>
@@ -450,23 +429,21 @@
         </w:tc>
       </w:tr>
       <w:tr>
-        <w:trPr/>
-        <w:tc>
-          <w:tcPr>
-            <w:tcW w:type="dxa" w:w="914"/>
-            <w:vAlign w:val="center"/>
-            <w:tcMar>
-              <w:top w:w="80" w:type="dxa"/>
-              <w:bottom w:w="80" w:type="dxa"/>
-              <w:start w:w="120" w:type="dxa"/>
-              <w:end w:w="120" w:type="dxa"/>
-            </w:tcMar>
-          </w:tcPr>
-          <w:p>
-            <w:pPr>
-              <w:spacing w:before="0" w:after="40" w:line="240" w:lineRule="auto"/>
-            </w:pPr>
-            <w:r/>
+        <w:tc>
+          <w:tcPr>
+            <w:tcW w:w="914" w:type="dxa"/>
+            <w:tcMar>
+              <w:top w:w="80" w:type="dxa"/>
+              <w:left w:w="120" w:type="dxa"/>
+              <w:bottom w:w="80" w:type="dxa"/>
+              <w:right w:w="120" w:type="dxa"/>
+            </w:tcMar>
+            <w:vAlign w:val="center"/>
+          </w:tcPr>
+          <w:p>
+            <w:pPr>
+              <w:spacing w:after="40" w:line="240" w:lineRule="auto"/>
+            </w:pPr>
             <w:r>
               <w:rPr>
                 <w:rFonts w:ascii="Calibri" w:hAnsi="Calibri"/>
@@ -479,24 +456,22 @@
         </w:tc>
         <w:tc>
           <w:tcPr>
-            <w:tcW w:type="dxa" w:w="2409"/>
-            <w:vAlign w:val="center"/>
-            <w:tcMar>
-              <w:top w:w="80" w:type="dxa"/>
-              <w:bottom w:w="80" w:type="dxa"/>
-              <w:start w:w="120" w:type="dxa"/>
-              <w:end w:w="120" w:type="dxa"/>
-            </w:tcMar>
-          </w:tcPr>
-          <w:p>
-            <w:pPr>
-              <w:spacing w:before="0" w:after="40" w:line="240" w:lineRule="auto"/>
-            </w:pPr>
-            <w:r/>
-            <w:r>
-              <w:rPr>
-                <w:rFonts w:ascii="Calibri" w:hAnsi="Calibri"/>
-                <w:b w:val="0"/>
+            <w:tcW w:w="2409" w:type="dxa"/>
+            <w:tcMar>
+              <w:top w:w="80" w:type="dxa"/>
+              <w:left w:w="120" w:type="dxa"/>
+              <w:bottom w:w="80" w:type="dxa"/>
+              <w:right w:w="120" w:type="dxa"/>
+            </w:tcMar>
+            <w:vAlign w:val="center"/>
+          </w:tcPr>
+          <w:p>
+            <w:pPr>
+              <w:spacing w:after="40" w:line="240" w:lineRule="auto"/>
+            </w:pPr>
+            <w:r>
+              <w:rPr>
+                <w:rFonts w:ascii="Calibri" w:hAnsi="Calibri"/>
                 <w:sz w:val="17"/>
               </w:rPr>
               <w:t>The base plate shall retain the current mounting envelope.</w:t>
@@ -505,24 +480,22 @@
         </w:tc>
         <w:tc>
           <w:tcPr>
-            <w:tcW w:type="dxa" w:w="2575"/>
-            <w:vAlign w:val="center"/>
-            <w:tcMar>
-              <w:top w:w="80" w:type="dxa"/>
-              <w:bottom w:w="80" w:type="dxa"/>
-              <w:start w:w="120" w:type="dxa"/>
-              <w:end w:w="120" w:type="dxa"/>
-            </w:tcMar>
-          </w:tcPr>
-          <w:p>
-            <w:pPr>
-              <w:spacing w:before="0" w:after="40" w:line="240" w:lineRule="auto"/>
-            </w:pPr>
-            <w:r/>
-            <w:r>
-              <w:rPr>
-                <w:rFonts w:ascii="Calibri" w:hAnsi="Calibri"/>
-                <w:b w:val="0"/>
+            <w:tcW w:w="2575" w:type="dxa"/>
+            <w:tcMar>
+              <w:top w:w="80" w:type="dxa"/>
+              <w:left w:w="120" w:type="dxa"/>
+              <w:bottom w:w="80" w:type="dxa"/>
+              <w:right w:w="120" w:type="dxa"/>
+            </w:tcMar>
+            <w:vAlign w:val="center"/>
+          </w:tcPr>
+          <w:p>
+            <w:pPr>
+              <w:spacing w:after="40" w:line="240" w:lineRule="auto"/>
+            </w:pPr>
+            <w:r>
+              <w:rPr>
+                <w:rFonts w:ascii="Calibri" w:hAnsi="Calibri"/>
                 <w:sz w:val="17"/>
               </w:rPr>
               <w:t>100 x 90 x 6 mm nominal.</w:t>
@@ -531,24 +504,22 @@
         </w:tc>
         <w:tc>
           <w:tcPr>
-            <w:tcW w:type="dxa" w:w="2408"/>
-            <w:vAlign w:val="center"/>
-            <w:tcMar>
-              <w:top w:w="80" w:type="dxa"/>
-              <w:bottom w:w="80" w:type="dxa"/>
-              <w:start w:w="120" w:type="dxa"/>
-              <w:end w:w="120" w:type="dxa"/>
-            </w:tcMar>
-          </w:tcPr>
-          <w:p>
-            <w:pPr>
-              <w:spacing w:before="0" w:after="40" w:line="240" w:lineRule="auto"/>
-            </w:pPr>
-            <w:r/>
-            <w:r>
-              <w:rPr>
-                <w:rFonts w:ascii="Calibri" w:hAnsi="Calibri"/>
-                <w:b w:val="0"/>
+            <w:tcW w:w="2408" w:type="dxa"/>
+            <w:tcMar>
+              <w:top w:w="80" w:type="dxa"/>
+              <w:left w:w="120" w:type="dxa"/>
+              <w:bottom w:w="80" w:type="dxa"/>
+              <w:right w:w="120" w:type="dxa"/>
+            </w:tcMar>
+            <w:vAlign w:val="center"/>
+          </w:tcPr>
+          <w:p>
+            <w:pPr>
+              <w:spacing w:after="40" w:line="240" w:lineRule="auto"/>
+            </w:pPr>
+            <w:r>
+              <w:rPr>
+                <w:rFonts w:ascii="Calibri" w:hAnsi="Calibri"/>
                 <w:sz w:val="17"/>
               </w:rPr>
               <w:t>Measure the CAD model or inspect the released drawing.</w:t>
@@ -557,24 +528,22 @@
         </w:tc>
       </w:tr>
       <w:tr>
-        <w:trPr/>
-        <w:tc>
-          <w:tcPr>
-            <w:tcW w:type="dxa" w:w="914"/>
-            <w:vAlign w:val="center"/>
-            <w:shd w:fill="EAF2F8"/>
-            <w:tcMar>
-              <w:top w:w="80" w:type="dxa"/>
-              <w:bottom w:w="80" w:type="dxa"/>
-              <w:start w:w="120" w:type="dxa"/>
-              <w:end w:w="120" w:type="dxa"/>
-            </w:tcMar>
-          </w:tcPr>
-          <w:p>
-            <w:pPr>
-              <w:spacing w:before="0" w:after="40" w:line="240" w:lineRule="auto"/>
-            </w:pPr>
-            <w:r/>
+        <w:tc>
+          <w:tcPr>
+            <w:tcW w:w="914" w:type="dxa"/>
+            <w:shd w:val="clear" w:color="auto" w:fill="EAF2F8"/>
+            <w:tcMar>
+              <w:top w:w="80" w:type="dxa"/>
+              <w:left w:w="120" w:type="dxa"/>
+              <w:bottom w:w="80" w:type="dxa"/>
+              <w:right w:w="120" w:type="dxa"/>
+            </w:tcMar>
+            <w:vAlign w:val="center"/>
+          </w:tcPr>
+          <w:p>
+            <w:pPr>
+              <w:spacing w:after="40" w:line="240" w:lineRule="auto"/>
+            </w:pPr>
             <w:r>
               <w:rPr>
                 <w:rFonts w:ascii="Calibri" w:hAnsi="Calibri"/>
@@ -587,25 +556,23 @@
         </w:tc>
         <w:tc>
           <w:tcPr>
-            <w:tcW w:type="dxa" w:w="2409"/>
-            <w:vAlign w:val="center"/>
-            <w:shd w:fill="EAF2F8"/>
-            <w:tcMar>
-              <w:top w:w="80" w:type="dxa"/>
-              <w:bottom w:w="80" w:type="dxa"/>
-              <w:start w:w="120" w:type="dxa"/>
-              <w:end w:w="120" w:type="dxa"/>
-            </w:tcMar>
-          </w:tcPr>
-          <w:p>
-            <w:pPr>
-              <w:spacing w:before="0" w:after="40" w:line="240" w:lineRule="auto"/>
-            </w:pPr>
-            <w:r/>
-            <w:r>
-              <w:rPr>
-                <w:rFonts w:ascii="Calibri" w:hAnsi="Calibri"/>
-                <w:b w:val="0"/>
+            <w:tcW w:w="2409" w:type="dxa"/>
+            <w:shd w:val="clear" w:color="auto" w:fill="EAF2F8"/>
+            <w:tcMar>
+              <w:top w:w="80" w:type="dxa"/>
+              <w:left w:w="120" w:type="dxa"/>
+              <w:bottom w:w="80" w:type="dxa"/>
+              <w:right w:w="120" w:type="dxa"/>
+            </w:tcMar>
+            <w:vAlign w:val="center"/>
+          </w:tcPr>
+          <w:p>
+            <w:pPr>
+              <w:spacing w:after="40" w:line="240" w:lineRule="auto"/>
+            </w:pPr>
+            <w:r>
+              <w:rPr>
+                <w:rFonts w:ascii="Calibri" w:hAnsi="Calibri"/>
                 <w:sz w:val="17"/>
               </w:rPr>
               <w:t>Each adjustment slot shall match the final CAD geometry.</w:t>
@@ -614,25 +581,23 @@
         </w:tc>
         <w:tc>
           <w:tcPr>
-            <w:tcW w:type="dxa" w:w="2575"/>
-            <w:vAlign w:val="center"/>
-            <w:shd w:fill="EAF2F8"/>
-            <w:tcMar>
-              <w:top w:w="80" w:type="dxa"/>
-              <w:bottom w:w="80" w:type="dxa"/>
-              <w:start w:w="120" w:type="dxa"/>
-              <w:end w:w="120" w:type="dxa"/>
-            </w:tcMar>
-          </w:tcPr>
-          <w:p>
-            <w:pPr>
-              <w:spacing w:before="0" w:after="40" w:line="240" w:lineRule="auto"/>
-            </w:pPr>
-            <w:r/>
-            <w:r>
-              <w:rPr>
-                <w:rFonts w:ascii="Calibri" w:hAnsi="Calibri"/>
-                <w:b w:val="0"/>
+            <w:tcW w:w="2575" w:type="dxa"/>
+            <w:shd w:val="clear" w:color="auto" w:fill="EAF2F8"/>
+            <w:tcMar>
+              <w:top w:w="80" w:type="dxa"/>
+              <w:left w:w="120" w:type="dxa"/>
+              <w:bottom w:w="80" w:type="dxa"/>
+              <w:right w:w="120" w:type="dxa"/>
+            </w:tcMar>
+            <w:vAlign w:val="center"/>
+          </w:tcPr>
+          <w:p>
+            <w:pPr>
+              <w:spacing w:after="40" w:line="240" w:lineRule="auto"/>
+            </w:pPr>
+            <w:r>
+              <w:rPr>
+                <w:rFonts w:ascii="Calibri" w:hAnsi="Calibri"/>
                 <w:sz w:val="17"/>
               </w:rPr>
               <w:t>6 mm width, 18 mm between end-arc centers, and 24 mm overall length.</w:t>
@@ -641,25 +606,23 @@
         </w:tc>
         <w:tc>
           <w:tcPr>
-            <w:tcW w:type="dxa" w:w="2408"/>
-            <w:vAlign w:val="center"/>
-            <w:shd w:fill="EAF2F8"/>
-            <w:tcMar>
-              <w:top w:w="80" w:type="dxa"/>
-              <w:bottom w:w="80" w:type="dxa"/>
-              <w:start w:w="120" w:type="dxa"/>
-              <w:end w:w="120" w:type="dxa"/>
-            </w:tcMar>
-          </w:tcPr>
-          <w:p>
-            <w:pPr>
-              <w:spacing w:before="0" w:after="40" w:line="240" w:lineRule="auto"/>
-            </w:pPr>
-            <w:r/>
-            <w:r>
-              <w:rPr>
-                <w:rFonts w:ascii="Calibri" w:hAnsi="Calibri"/>
-                <w:b w:val="0"/>
+            <w:tcW w:w="2408" w:type="dxa"/>
+            <w:shd w:val="clear" w:color="auto" w:fill="EAF2F8"/>
+            <w:tcMar>
+              <w:top w:w="80" w:type="dxa"/>
+              <w:left w:w="120" w:type="dxa"/>
+              <w:bottom w:w="80" w:type="dxa"/>
+              <w:right w:w="120" w:type="dxa"/>
+            </w:tcMar>
+            <w:vAlign w:val="center"/>
+          </w:tcPr>
+          <w:p>
+            <w:pPr>
+              <w:spacing w:after="40" w:line="240" w:lineRule="auto"/>
+            </w:pPr>
+            <w:r>
+              <w:rPr>
+                <w:rFonts w:ascii="Calibri" w:hAnsi="Calibri"/>
                 <w:sz w:val="17"/>
               </w:rPr>
               <w:t>Measure the slots in the CAD model or released drawing.</w:t>
@@ -668,23 +631,21 @@
         </w:tc>
       </w:tr>
       <w:tr>
-        <w:trPr/>
-        <w:tc>
-          <w:tcPr>
-            <w:tcW w:type="dxa" w:w="914"/>
-            <w:vAlign w:val="center"/>
-            <w:tcMar>
-              <w:top w:w="80" w:type="dxa"/>
-              <w:bottom w:w="80" w:type="dxa"/>
-              <w:start w:w="120" w:type="dxa"/>
-              <w:end w:w="120" w:type="dxa"/>
-            </w:tcMar>
-          </w:tcPr>
-          <w:p>
-            <w:pPr>
-              <w:spacing w:before="0" w:after="40" w:line="240" w:lineRule="auto"/>
-            </w:pPr>
-            <w:r/>
+        <w:tc>
+          <w:tcPr>
+            <w:tcW w:w="914" w:type="dxa"/>
+            <w:tcMar>
+              <w:top w:w="80" w:type="dxa"/>
+              <w:left w:w="120" w:type="dxa"/>
+              <w:bottom w:w="80" w:type="dxa"/>
+              <w:right w:w="120" w:type="dxa"/>
+            </w:tcMar>
+            <w:vAlign w:val="center"/>
+          </w:tcPr>
+          <w:p>
+            <w:pPr>
+              <w:spacing w:after="40" w:line="240" w:lineRule="auto"/>
+            </w:pPr>
             <w:r>
               <w:rPr>
                 <w:rFonts w:ascii="Calibri" w:hAnsi="Calibri"/>
@@ -697,24 +658,22 @@
         </w:tc>
         <w:tc>
           <w:tcPr>
-            <w:tcW w:type="dxa" w:w="2409"/>
-            <w:vAlign w:val="center"/>
-            <w:tcMar>
-              <w:top w:w="80" w:type="dxa"/>
-              <w:bottom w:w="80" w:type="dxa"/>
-              <w:start w:w="120" w:type="dxa"/>
-              <w:end w:w="120" w:type="dxa"/>
-            </w:tcMar>
-          </w:tcPr>
-          <w:p>
-            <w:pPr>
-              <w:spacing w:before="0" w:after="40" w:line="240" w:lineRule="auto"/>
-            </w:pPr>
-            <w:r/>
-            <w:r>
-              <w:rPr>
-                <w:rFonts w:ascii="Calibri" w:hAnsi="Calibri"/>
-                <w:b w:val="0"/>
+            <w:tcW w:w="2409" w:type="dxa"/>
+            <w:tcMar>
+              <w:top w:w="80" w:type="dxa"/>
+              <w:left w:w="120" w:type="dxa"/>
+              <w:bottom w:w="80" w:type="dxa"/>
+              <w:right w:w="120" w:type="dxa"/>
+            </w:tcMar>
+            <w:vAlign w:val="center"/>
+          </w:tcPr>
+          <w:p>
+            <w:pPr>
+              <w:spacing w:after="40" w:line="240" w:lineRule="auto"/>
+            </w:pPr>
+            <w:r>
+              <w:rPr>
+                <w:rFonts w:ascii="Calibri" w:hAnsi="Calibri"/>
                 <w:sz w:val="17"/>
               </w:rPr>
               <w:t>The motor position shall be linearly adjustable along one axis.</w:t>
@@ -723,24 +682,22 @@
         </w:tc>
         <w:tc>
           <w:tcPr>
-            <w:tcW w:type="dxa" w:w="2575"/>
-            <w:vAlign w:val="center"/>
-            <w:tcMar>
-              <w:top w:w="80" w:type="dxa"/>
-              <w:bottom w:w="80" w:type="dxa"/>
-              <w:start w:w="120" w:type="dxa"/>
-              <w:end w:w="120" w:type="dxa"/>
-            </w:tcMar>
-          </w:tcPr>
-          <w:p>
-            <w:pPr>
-              <w:spacing w:before="0" w:after="40" w:line="240" w:lineRule="auto"/>
-            </w:pPr>
-            <w:r/>
-            <w:r>
-              <w:rPr>
-                <w:rFonts w:ascii="Calibri" w:hAnsi="Calibri"/>
-                <w:b w:val="0"/>
+            <w:tcW w:w="2575" w:type="dxa"/>
+            <w:tcMar>
+              <w:top w:w="80" w:type="dxa"/>
+              <w:left w:w="120" w:type="dxa"/>
+              <w:bottom w:w="80" w:type="dxa"/>
+              <w:right w:w="120" w:type="dxa"/>
+            </w:tcMar>
+            <w:vAlign w:val="center"/>
+          </w:tcPr>
+          <w:p>
+            <w:pPr>
+              <w:spacing w:after="40" w:line="240" w:lineRule="auto"/>
+            </w:pPr>
+            <w:r>
+              <w:rPr>
+                <w:rFonts w:ascii="Calibri" w:hAnsi="Calibri"/>
                 <w:sz w:val="17"/>
               </w:rPr>
               <w:t>At least 18 mm of usable linear adjustment.</w:t>
@@ -749,24 +706,22 @@
         </w:tc>
         <w:tc>
           <w:tcPr>
-            <w:tcW w:type="dxa" w:w="2408"/>
-            <w:vAlign w:val="center"/>
-            <w:tcMar>
-              <w:top w:w="80" w:type="dxa"/>
-              <w:bottom w:w="80" w:type="dxa"/>
-              <w:start w:w="120" w:type="dxa"/>
-              <w:end w:w="120" w:type="dxa"/>
-            </w:tcMar>
-          </w:tcPr>
-          <w:p>
-            <w:pPr>
-              <w:spacing w:before="0" w:after="40" w:line="240" w:lineRule="auto"/>
-            </w:pPr>
-            <w:r/>
-            <w:r>
-              <w:rPr>
-                <w:rFonts w:ascii="Calibri" w:hAnsi="Calibri"/>
-                <w:b w:val="0"/>
+            <w:tcW w:w="2408" w:type="dxa"/>
+            <w:tcMar>
+              <w:top w:w="80" w:type="dxa"/>
+              <w:left w:w="120" w:type="dxa"/>
+              <w:bottom w:w="80" w:type="dxa"/>
+              <w:right w:w="120" w:type="dxa"/>
+            </w:tcMar>
+            <w:vAlign w:val="center"/>
+          </w:tcPr>
+          <w:p>
+            <w:pPr>
+              <w:spacing w:after="40" w:line="240" w:lineRule="auto"/>
+            </w:pPr>
+            <w:r>
+              <w:rPr>
+                <w:rFonts w:ascii="Calibri" w:hAnsi="Calibri"/>
                 <w:sz w:val="17"/>
               </w:rPr>
               <w:t>Measure the motor displacement between the two valid extreme positions in CAD or on a prototype.</w:t>
@@ -775,24 +730,22 @@
         </w:tc>
       </w:tr>
       <w:tr>
-        <w:trPr/>
-        <w:tc>
-          <w:tcPr>
-            <w:tcW w:type="dxa" w:w="914"/>
-            <w:vAlign w:val="center"/>
-            <w:shd w:fill="EAF2F8"/>
-            <w:tcMar>
-              <w:top w:w="80" w:type="dxa"/>
-              <w:bottom w:w="80" w:type="dxa"/>
-              <w:start w:w="120" w:type="dxa"/>
-              <w:end w:w="120" w:type="dxa"/>
-            </w:tcMar>
-          </w:tcPr>
-          <w:p>
-            <w:pPr>
-              <w:spacing w:before="0" w:after="40" w:line="240" w:lineRule="auto"/>
-            </w:pPr>
-            <w:r/>
+        <w:tc>
+          <w:tcPr>
+            <w:tcW w:w="914" w:type="dxa"/>
+            <w:shd w:val="clear" w:color="auto" w:fill="EAF2F8"/>
+            <w:tcMar>
+              <w:top w:w="80" w:type="dxa"/>
+              <w:left w:w="120" w:type="dxa"/>
+              <w:bottom w:w="80" w:type="dxa"/>
+              <w:right w:w="120" w:type="dxa"/>
+            </w:tcMar>
+            <w:vAlign w:val="center"/>
+          </w:tcPr>
+          <w:p>
+            <w:pPr>
+              <w:spacing w:after="40" w:line="240" w:lineRule="auto"/>
+            </w:pPr>
             <w:r>
               <w:rPr>
                 <w:rFonts w:ascii="Calibri" w:hAnsi="Calibri"/>
@@ -805,25 +758,23 @@
         </w:tc>
         <w:tc>
           <w:tcPr>
-            <w:tcW w:type="dxa" w:w="2409"/>
-            <w:vAlign w:val="center"/>
-            <w:shd w:fill="EAF2F8"/>
-            <w:tcMar>
-              <w:top w:w="80" w:type="dxa"/>
-              <w:bottom w:w="80" w:type="dxa"/>
-              <w:start w:w="120" w:type="dxa"/>
-              <w:end w:w="120" w:type="dxa"/>
-            </w:tcMar>
-          </w:tcPr>
-          <w:p>
-            <w:pPr>
-              <w:spacing w:before="0" w:after="40" w:line="240" w:lineRule="auto"/>
-            </w:pPr>
-            <w:r/>
-            <w:r>
-              <w:rPr>
-                <w:rFonts w:ascii="Calibri" w:hAnsi="Calibri"/>
-                <w:b w:val="0"/>
+            <w:tcW w:w="2409" w:type="dxa"/>
+            <w:shd w:val="clear" w:color="auto" w:fill="EAF2F8"/>
+            <w:tcMar>
+              <w:top w:w="80" w:type="dxa"/>
+              <w:left w:w="120" w:type="dxa"/>
+              <w:bottom w:w="80" w:type="dxa"/>
+              <w:right w:w="120" w:type="dxa"/>
+            </w:tcMar>
+            <w:vAlign w:val="center"/>
+          </w:tcPr>
+          <w:p>
+            <w:pPr>
+              <w:spacing w:after="40" w:line="240" w:lineRule="auto"/>
+            </w:pPr>
+            <w:r>
+              <w:rPr>
+                <w:rFonts w:ascii="Calibri" w:hAnsi="Calibri"/>
                 <w:sz w:val="17"/>
               </w:rPr>
               <w:t>Components shall remain clear throughout the full adjustment range.</w:t>
@@ -832,25 +783,23 @@
         </w:tc>
         <w:tc>
           <w:tcPr>
-            <w:tcW w:type="dxa" w:w="2575"/>
-            <w:vAlign w:val="center"/>
-            <w:shd w:fill="EAF2F8"/>
-            <w:tcMar>
-              <w:top w:w="80" w:type="dxa"/>
-              <w:bottom w:w="80" w:type="dxa"/>
-              <w:start w:w="120" w:type="dxa"/>
-              <w:end w:w="120" w:type="dxa"/>
-            </w:tcMar>
-          </w:tcPr>
-          <w:p>
-            <w:pPr>
-              <w:spacing w:before="0" w:after="40" w:line="240" w:lineRule="auto"/>
-            </w:pPr>
-            <w:r/>
-            <w:r>
-              <w:rPr>
-                <w:rFonts w:ascii="Calibri" w:hAnsi="Calibri"/>
-                <w:b w:val="0"/>
+            <w:tcW w:w="2575" w:type="dxa"/>
+            <w:shd w:val="clear" w:color="auto" w:fill="EAF2F8"/>
+            <w:tcMar>
+              <w:top w:w="80" w:type="dxa"/>
+              <w:left w:w="120" w:type="dxa"/>
+              <w:bottom w:w="80" w:type="dxa"/>
+              <w:right w:w="120" w:type="dxa"/>
+            </w:tcMar>
+            <w:vAlign w:val="center"/>
+          </w:tcPr>
+          <w:p>
+            <w:pPr>
+              <w:spacing w:after="40" w:line="240" w:lineRule="auto"/>
+            </w:pPr>
+            <w:r>
+              <w:rPr>
+                <w:rFonts w:ascii="Calibri" w:hAnsi="Calibri"/>
                 <w:sz w:val="17"/>
               </w:rPr>
               <w:t>No interference between the motor, plates, shaft, slots, or fasteners across the complete 18 mm travel.</w:t>
@@ -859,25 +808,23 @@
         </w:tc>
         <w:tc>
           <w:tcPr>
-            <w:tcW w:type="dxa" w:w="2408"/>
-            <w:vAlign w:val="center"/>
-            <w:shd w:fill="EAF2F8"/>
-            <w:tcMar>
-              <w:top w:w="80" w:type="dxa"/>
-              <w:bottom w:w="80" w:type="dxa"/>
-              <w:start w:w="120" w:type="dxa"/>
-              <w:end w:w="120" w:type="dxa"/>
-            </w:tcMar>
-          </w:tcPr>
-          <w:p>
-            <w:pPr>
-              <w:spacing w:before="0" w:after="40" w:line="240" w:lineRule="auto"/>
-            </w:pPr>
-            <w:r/>
-            <w:r>
-              <w:rPr>
-                <w:rFonts w:ascii="Calibri" w:hAnsi="Calibri"/>
-                <w:b w:val="0"/>
+            <w:tcW w:w="2408" w:type="dxa"/>
+            <w:shd w:val="clear" w:color="auto" w:fill="EAF2F8"/>
+            <w:tcMar>
+              <w:top w:w="80" w:type="dxa"/>
+              <w:left w:w="120" w:type="dxa"/>
+              <w:bottom w:w="80" w:type="dxa"/>
+              <w:right w:w="120" w:type="dxa"/>
+            </w:tcMar>
+            <w:vAlign w:val="center"/>
+          </w:tcPr>
+          <w:p>
+            <w:pPr>
+              <w:spacing w:after="40" w:line="240" w:lineRule="auto"/>
+            </w:pPr>
+            <w:r>
+              <w:rPr>
+                <w:rFonts w:ascii="Calibri" w:hAnsi="Calibri"/>
                 <w:sz w:val="17"/>
               </w:rPr>
               <w:t>Run a SolidWorks interference check at both travel limits and inspect intermediate positions.</w:t>
@@ -886,23 +833,21 @@
         </w:tc>
       </w:tr>
       <w:tr>
-        <w:trPr/>
-        <w:tc>
-          <w:tcPr>
-            <w:tcW w:type="dxa" w:w="914"/>
-            <w:vAlign w:val="center"/>
-            <w:tcMar>
-              <w:top w:w="80" w:type="dxa"/>
-              <w:bottom w:w="80" w:type="dxa"/>
-              <w:start w:w="120" w:type="dxa"/>
-              <w:end w:w="120" w:type="dxa"/>
-            </w:tcMar>
-          </w:tcPr>
-          <w:p>
-            <w:pPr>
-              <w:spacing w:before="0" w:after="40" w:line="240" w:lineRule="auto"/>
-            </w:pPr>
-            <w:r/>
+        <w:tc>
+          <w:tcPr>
+            <w:tcW w:w="914" w:type="dxa"/>
+            <w:tcMar>
+              <w:top w:w="80" w:type="dxa"/>
+              <w:left w:w="120" w:type="dxa"/>
+              <w:bottom w:w="80" w:type="dxa"/>
+              <w:right w:w="120" w:type="dxa"/>
+            </w:tcMar>
+            <w:vAlign w:val="center"/>
+          </w:tcPr>
+          <w:p>
+            <w:pPr>
+              <w:spacing w:after="40" w:line="240" w:lineRule="auto"/>
+            </w:pPr>
             <w:r>
               <w:rPr>
                 <w:rFonts w:ascii="Calibri" w:hAnsi="Calibri"/>
@@ -915,24 +860,22 @@
         </w:tc>
         <w:tc>
           <w:tcPr>
-            <w:tcW w:type="dxa" w:w="2409"/>
-            <w:vAlign w:val="center"/>
-            <w:tcMar>
-              <w:top w:w="80" w:type="dxa"/>
-              <w:bottom w:w="80" w:type="dxa"/>
-              <w:start w:w="120" w:type="dxa"/>
-              <w:end w:w="120" w:type="dxa"/>
-            </w:tcMar>
-          </w:tcPr>
-          <w:p>
-            <w:pPr>
-              <w:spacing w:before="0" w:after="40" w:line="240" w:lineRule="auto"/>
-            </w:pPr>
-            <w:r/>
-            <w:r>
-              <w:rPr>
-                <w:rFonts w:ascii="Calibri" w:hAnsi="Calibri"/>
-                <w:b w:val="0"/>
+            <w:tcW w:w="2409" w:type="dxa"/>
+            <w:tcMar>
+              <w:top w:w="80" w:type="dxa"/>
+              <w:left w:w="120" w:type="dxa"/>
+              <w:bottom w:w="80" w:type="dxa"/>
+              <w:right w:w="120" w:type="dxa"/>
+            </w:tcMar>
+            <w:vAlign w:val="center"/>
+          </w:tcPr>
+          <w:p>
+            <w:pPr>
+              <w:spacing w:after="40" w:line="240" w:lineRule="auto"/>
+            </w:pPr>
+            <w:r>
+              <w:rPr>
+                <w:rFonts w:ascii="Calibri" w:hAnsi="Calibri"/>
                 <w:sz w:val="17"/>
               </w:rPr>
               <w:t>The adjustment joint shall retain its selected position during representative bench operation.</w:t>
@@ -941,24 +884,22 @@
         </w:tc>
         <w:tc>
           <w:tcPr>
-            <w:tcW w:type="dxa" w:w="2575"/>
-            <w:vAlign w:val="center"/>
-            <w:tcMar>
-              <w:top w:w="80" w:type="dxa"/>
-              <w:bottom w:w="80" w:type="dxa"/>
-              <w:start w:w="120" w:type="dxa"/>
-              <w:end w:w="120" w:type="dxa"/>
-            </w:tcMar>
-          </w:tcPr>
-          <w:p>
-            <w:pPr>
-              <w:spacing w:before="0" w:after="40" w:line="240" w:lineRule="auto"/>
-            </w:pPr>
-            <w:r/>
-            <w:r>
-              <w:rPr>
-                <w:rFonts w:ascii="Calibri" w:hAnsi="Calibri"/>
-                <w:b w:val="0"/>
+            <w:tcW w:w="2575" w:type="dxa"/>
+            <w:tcMar>
+              <w:top w:w="80" w:type="dxa"/>
+              <w:left w:w="120" w:type="dxa"/>
+              <w:bottom w:w="80" w:type="dxa"/>
+              <w:right w:w="120" w:type="dxa"/>
+            </w:tcMar>
+            <w:vAlign w:val="center"/>
+          </w:tcPr>
+          <w:p>
+            <w:pPr>
+              <w:spacing w:after="40" w:line="240" w:lineRule="auto"/>
+            </w:pPr>
+            <w:r>
+              <w:rPr>
+                <w:rFonts w:ascii="Calibri" w:hAnsi="Calibri"/>
                 <w:sz w:val="17"/>
               </w:rPr>
               <w:t>No visible slip under a 30 N lateral static load. The 30 N load is a provisional portfolio design assumption, not a verified operating or safety rating.</w:t>
@@ -967,24 +908,22 @@
         </w:tc>
         <w:tc>
           <w:tcPr>
-            <w:tcW w:type="dxa" w:w="2408"/>
-            <w:vAlign w:val="center"/>
-            <w:tcMar>
-              <w:top w:w="80" w:type="dxa"/>
-              <w:bottom w:w="80" w:type="dxa"/>
-              <w:start w:w="120" w:type="dxa"/>
-              <w:end w:w="120" w:type="dxa"/>
-            </w:tcMar>
-          </w:tcPr>
-          <w:p>
-            <w:pPr>
-              <w:spacing w:before="0" w:after="40" w:line="240" w:lineRule="auto"/>
-            </w:pPr>
-            <w:r/>
-            <w:r>
-              <w:rPr>
-                <w:rFonts w:ascii="Calibri" w:hAnsi="Calibri"/>
-                <w:b w:val="0"/>
+            <w:tcW w:w="2408" w:type="dxa"/>
+            <w:tcMar>
+              <w:top w:w="80" w:type="dxa"/>
+              <w:left w:w="120" w:type="dxa"/>
+              <w:bottom w:w="80" w:type="dxa"/>
+              <w:right w:w="120" w:type="dxa"/>
+            </w:tcMar>
+            <w:vAlign w:val="center"/>
+          </w:tcPr>
+          <w:p>
+            <w:pPr>
+              <w:spacing w:after="40" w:line="240" w:lineRule="auto"/>
+            </w:pPr>
+            <w:r>
+              <w:rPr>
+                <w:rFonts w:ascii="Calibri" w:hAnsi="Calibri"/>
                 <w:sz w:val="17"/>
               </w:rPr>
               <w:t>Apply a 30 N lateral load to the mounted motor and compare its position before and after the test.</w:t>
@@ -993,24 +932,22 @@
         </w:tc>
       </w:tr>
       <w:tr>
-        <w:trPr/>
-        <w:tc>
-          <w:tcPr>
-            <w:tcW w:type="dxa" w:w="914"/>
-            <w:vAlign w:val="center"/>
-            <w:shd w:fill="EAF2F8"/>
-            <w:tcMar>
-              <w:top w:w="80" w:type="dxa"/>
-              <w:bottom w:w="80" w:type="dxa"/>
-              <w:start w:w="120" w:type="dxa"/>
-              <w:end w:w="120" w:type="dxa"/>
-            </w:tcMar>
-          </w:tcPr>
-          <w:p>
-            <w:pPr>
-              <w:spacing w:before="0" w:after="40" w:line="240" w:lineRule="auto"/>
-            </w:pPr>
-            <w:r/>
+        <w:tc>
+          <w:tcPr>
+            <w:tcW w:w="914" w:type="dxa"/>
+            <w:shd w:val="clear" w:color="auto" w:fill="EAF2F8"/>
+            <w:tcMar>
+              <w:top w:w="80" w:type="dxa"/>
+              <w:left w:w="120" w:type="dxa"/>
+              <w:bottom w:w="80" w:type="dxa"/>
+              <w:right w:w="120" w:type="dxa"/>
+            </w:tcMar>
+            <w:vAlign w:val="center"/>
+          </w:tcPr>
+          <w:p>
+            <w:pPr>
+              <w:spacing w:after="40" w:line="240" w:lineRule="auto"/>
+            </w:pPr>
             <w:r>
               <w:rPr>
                 <w:rFonts w:ascii="Calibri" w:hAnsi="Calibri"/>
@@ -1023,25 +960,23 @@
         </w:tc>
         <w:tc>
           <w:tcPr>
-            <w:tcW w:type="dxa" w:w="2409"/>
-            <w:vAlign w:val="center"/>
-            <w:shd w:fill="EAF2F8"/>
-            <w:tcMar>
-              <w:top w:w="80" w:type="dxa"/>
-              <w:bottom w:w="80" w:type="dxa"/>
-              <w:start w:w="120" w:type="dxa"/>
-              <w:end w:w="120" w:type="dxa"/>
-            </w:tcMar>
-          </w:tcPr>
-          <w:p>
-            <w:pPr>
-              <w:spacing w:before="0" w:after="40" w:line="240" w:lineRule="auto"/>
-            </w:pPr>
-            <w:r/>
-            <w:r>
-              <w:rPr>
-                <w:rFonts w:ascii="Calibri" w:hAnsi="Calibri"/>
-                <w:b w:val="0"/>
+            <w:tcW w:w="2409" w:type="dxa"/>
+            <w:shd w:val="clear" w:color="auto" w:fill="EAF2F8"/>
+            <w:tcMar>
+              <w:top w:w="80" w:type="dxa"/>
+              <w:left w:w="120" w:type="dxa"/>
+              <w:bottom w:w="80" w:type="dxa"/>
+              <w:right w:w="120" w:type="dxa"/>
+            </w:tcMar>
+            <w:vAlign w:val="center"/>
+          </w:tcPr>
+          <w:p>
+            <w:pPr>
+              <w:spacing w:after="40" w:line="240" w:lineRule="auto"/>
+            </w:pPr>
+            <w:r>
+              <w:rPr>
+                <w:rFonts w:ascii="Calibri" w:hAnsi="Calibri"/>
                 <w:sz w:val="17"/>
               </w:rPr>
               <w:t>Structural stresses shall remain below the selected material's yield strength under the assumed load.</w:t>
@@ -1050,25 +985,23 @@
         </w:tc>
         <w:tc>
           <w:tcPr>
-            <w:tcW w:type="dxa" w:w="2575"/>
-            <w:vAlign w:val="center"/>
-            <w:shd w:fill="EAF2F8"/>
-            <w:tcMar>
-              <w:top w:w="80" w:type="dxa"/>
-              <w:bottom w:w="80" w:type="dxa"/>
-              <w:start w:w="120" w:type="dxa"/>
-              <w:end w:w="120" w:type="dxa"/>
-            </w:tcMar>
-          </w:tcPr>
-          <w:p>
-            <w:pPr>
-              <w:spacing w:before="0" w:after="40" w:line="240" w:lineRule="auto"/>
-            </w:pPr>
-            <w:r/>
-            <w:r>
-              <w:rPr>
-                <w:rFonts w:ascii="Calibri" w:hAnsi="Calibri"/>
-                <w:b w:val="0"/>
+            <w:tcW w:w="2575" w:type="dxa"/>
+            <w:shd w:val="clear" w:color="auto" w:fill="EAF2F8"/>
+            <w:tcMar>
+              <w:top w:w="80" w:type="dxa"/>
+              <w:left w:w="120" w:type="dxa"/>
+              <w:bottom w:w="80" w:type="dxa"/>
+              <w:right w:w="120" w:type="dxa"/>
+            </w:tcMar>
+            <w:vAlign w:val="center"/>
+          </w:tcPr>
+          <w:p>
+            <w:pPr>
+              <w:spacing w:after="40" w:line="240" w:lineRule="auto"/>
+            </w:pPr>
+            <w:r>
+              <w:rPr>
+                <w:rFonts w:ascii="Calibri" w:hAnsi="Calibri"/>
                 <w:sz w:val="17"/>
               </w:rPr>
               <w:t>Calculated factor of safety &gt;= 2 under the provisional 30 N lateral static load. The factor-of-safety target is a provisional portfolio design assumption and must be reassessed when actual operating loads are known.</w:t>
@@ -1077,25 +1010,23 @@
         </w:tc>
         <w:tc>
           <w:tcPr>
-            <w:tcW w:type="dxa" w:w="2408"/>
-            <w:vAlign w:val="center"/>
-            <w:shd w:fill="EAF2F8"/>
-            <w:tcMar>
-              <w:top w:w="80" w:type="dxa"/>
-              <w:bottom w:w="80" w:type="dxa"/>
-              <w:start w:w="120" w:type="dxa"/>
-              <w:end w:w="120" w:type="dxa"/>
-            </w:tcMar>
-          </w:tcPr>
-          <w:p>
-            <w:pPr>
-              <w:spacing w:before="0" w:after="40" w:line="240" w:lineRule="auto"/>
-            </w:pPr>
-            <w:r/>
-            <w:r>
-              <w:rPr>
-                <w:rFonts w:ascii="Calibri" w:hAnsi="Calibri"/>
-                <w:b w:val="0"/>
+            <w:tcW w:w="2408" w:type="dxa"/>
+            <w:shd w:val="clear" w:color="auto" w:fill="EAF2F8"/>
+            <w:tcMar>
+              <w:top w:w="80" w:type="dxa"/>
+              <w:left w:w="120" w:type="dxa"/>
+              <w:bottom w:w="80" w:type="dxa"/>
+              <w:right w:w="120" w:type="dxa"/>
+            </w:tcMar>
+            <w:vAlign w:val="center"/>
+          </w:tcPr>
+          <w:p>
+            <w:pPr>
+              <w:spacing w:after="40" w:line="240" w:lineRule="auto"/>
+            </w:pPr>
+            <w:r>
+              <w:rPr>
+                <w:rFonts w:ascii="Calibri" w:hAnsi="Calibri"/>
                 <w:sz w:val="17"/>
               </w:rPr>
               <w:t>Perform documented calculations using stated material properties, geometry, boundary conditions, and load direction.</w:t>
@@ -1104,23 +1035,21 @@
         </w:tc>
       </w:tr>
       <w:tr>
-        <w:trPr/>
-        <w:tc>
-          <w:tcPr>
-            <w:tcW w:type="dxa" w:w="914"/>
-            <w:vAlign w:val="center"/>
-            <w:tcMar>
-              <w:top w:w="80" w:type="dxa"/>
-              <w:bottom w:w="80" w:type="dxa"/>
-              <w:start w:w="120" w:type="dxa"/>
-              <w:end w:w="120" w:type="dxa"/>
-            </w:tcMar>
-          </w:tcPr>
-          <w:p>
-            <w:pPr>
-              <w:spacing w:before="0" w:after="40" w:line="240" w:lineRule="auto"/>
-            </w:pPr>
-            <w:r/>
+        <w:tc>
+          <w:tcPr>
+            <w:tcW w:w="914" w:type="dxa"/>
+            <w:tcMar>
+              <w:top w:w="80" w:type="dxa"/>
+              <w:left w:w="120" w:type="dxa"/>
+              <w:bottom w:w="80" w:type="dxa"/>
+              <w:right w:w="120" w:type="dxa"/>
+            </w:tcMar>
+            <w:vAlign w:val="center"/>
+          </w:tcPr>
+          <w:p>
+            <w:pPr>
+              <w:spacing w:after="40" w:line="240" w:lineRule="auto"/>
+            </w:pPr>
             <w:r>
               <w:rPr>
                 <w:rFonts w:ascii="Calibri" w:hAnsi="Calibri"/>
@@ -1133,24 +1062,22 @@
         </w:tc>
         <w:tc>
           <w:tcPr>
-            <w:tcW w:type="dxa" w:w="2409"/>
-            <w:vAlign w:val="center"/>
-            <w:tcMar>
-              <w:top w:w="80" w:type="dxa"/>
-              <w:bottom w:w="80" w:type="dxa"/>
-              <w:start w:w="120" w:type="dxa"/>
-              <w:end w:w="120" w:type="dxa"/>
-            </w:tcMar>
-          </w:tcPr>
-          <w:p>
-            <w:pPr>
-              <w:spacing w:before="0" w:after="40" w:line="240" w:lineRule="auto"/>
-            </w:pPr>
-            <w:r/>
-            <w:r>
-              <w:rPr>
-                <w:rFonts w:ascii="Calibri" w:hAnsi="Calibri"/>
-                <w:b w:val="0"/>
+            <w:tcW w:w="2409" w:type="dxa"/>
+            <w:tcMar>
+              <w:top w:w="80" w:type="dxa"/>
+              <w:left w:w="120" w:type="dxa"/>
+              <w:bottom w:w="80" w:type="dxa"/>
+              <w:right w:w="120" w:type="dxa"/>
+            </w:tcMar>
+            <w:vAlign w:val="center"/>
+          </w:tcPr>
+          <w:p>
+            <w:pPr>
+              <w:spacing w:after="40" w:line="240" w:lineRule="auto"/>
+            </w:pPr>
+            <w:r>
+              <w:rPr>
+                <w:rFonts w:ascii="Calibri" w:hAnsi="Calibri"/>
                 <w:sz w:val="17"/>
               </w:rPr>
               <w:t>The motor and adjustable joint shall use standard fasteners.</w:t>
@@ -1159,107 +1086,117 @@
         </w:tc>
         <w:tc>
           <w:tcPr>
-            <w:tcW w:type="dxa" w:w="2575"/>
-            <w:vAlign w:val="center"/>
-            <w:tcMar>
-              <w:top w:w="80" w:type="dxa"/>
-              <w:bottom w:w="80" w:type="dxa"/>
-              <w:start w:w="120" w:type="dxa"/>
-              <w:end w:w="120" w:type="dxa"/>
-            </w:tcMar>
-          </w:tcPr>
-          <w:p>
-            <w:pPr>
-              <w:spacing w:before="0" w:after="40" w:line="240" w:lineRule="auto"/>
-            </w:pPr>
-            <w:r/>
-            <w:r>
-              <w:rPr>
-                <w:rFonts w:ascii="Calibri" w:hAnsi="Calibri"/>
-                <w:b w:val="0"/>
-                <w:sz w:val="17"/>
-              </w:rPr>
-              <w:t>Four M3 motor fasteners and standard M5 adjustment fasteners consistent with the current CAD components.</w:t>
-            </w:r>
-          </w:p>
-        </w:tc>
-        <w:tc>
-          <w:tcPr>
-            <w:tcW w:type="dxa" w:w="2408"/>
-            <w:vAlign w:val="center"/>
-            <w:tcMar>
-              <w:top w:w="80" w:type="dxa"/>
-              <w:bottom w:w="80" w:type="dxa"/>
-              <w:start w:w="120" w:type="dxa"/>
-              <w:end w:w="120" w:type="dxa"/>
-            </w:tcMar>
-          </w:tcPr>
-          <w:p>
-            <w:pPr>
-              <w:spacing w:before="0" w:after="40" w:line="240" w:lineRule="auto"/>
-            </w:pPr>
-            <w:r/>
-            <w:r>
-              <w:rPr>
-                <w:rFonts w:ascii="Calibri" w:hAnsi="Calibri"/>
-                <w:b w:val="0"/>
-                <w:sz w:val="17"/>
-              </w:rPr>
-              <w:t>Inspect the CAD assembly, drawings, and BOM; verify clearance and thread engagement.</w:t>
+            <w:tcW w:w="2575" w:type="dxa"/>
+            <w:tcMar>
+              <w:top w:w="80" w:type="dxa"/>
+              <w:left w:w="120" w:type="dxa"/>
+              <w:bottom w:w="80" w:type="dxa"/>
+              <w:right w:w="120" w:type="dxa"/>
+            </w:tcMar>
+            <w:vAlign w:val="center"/>
+          </w:tcPr>
+          <w:p>
+            <w:pPr>
+              <w:spacing w:after="40" w:line="240" w:lineRule="auto"/>
+            </w:pPr>
+            <w:r>
+              <w:rPr>
+                <w:rFonts w:ascii="Calibri" w:hAnsi="Calibri"/>
+                <w:sz w:val="17"/>
+              </w:rPr>
+              <w:t xml:space="preserve">Four M3 motor fasteners and standard M5 adjustment </w:t>
+            </w:r>
+            <w:r>
+              <w:rPr>
+                <w:rFonts w:ascii="Calibri" w:hAnsi="Calibri"/>
+                <w:sz w:val="17"/>
+              </w:rPr>
+              <w:lastRenderedPageBreak/>
+              <w:t>fasteners consistent with the current CAD components.</w:t>
+            </w:r>
+          </w:p>
+        </w:tc>
+        <w:tc>
+          <w:tcPr>
+            <w:tcW w:w="2408" w:type="dxa"/>
+            <w:tcMar>
+              <w:top w:w="80" w:type="dxa"/>
+              <w:left w:w="120" w:type="dxa"/>
+              <w:bottom w:w="80" w:type="dxa"/>
+              <w:right w:w="120" w:type="dxa"/>
+            </w:tcMar>
+            <w:vAlign w:val="center"/>
+          </w:tcPr>
+          <w:p>
+            <w:pPr>
+              <w:spacing w:after="40" w:line="240" w:lineRule="auto"/>
+            </w:pPr>
+            <w:r>
+              <w:rPr>
+                <w:rFonts w:ascii="Calibri" w:hAnsi="Calibri"/>
+                <w:sz w:val="17"/>
+              </w:rPr>
+              <w:lastRenderedPageBreak/>
+              <w:t xml:space="preserve">Inspect the CAD assembly, drawings, and BOM; verify </w:t>
+            </w:r>
+            <w:r>
+              <w:rPr>
+                <w:rFonts w:ascii="Calibri" w:hAnsi="Calibri"/>
+                <w:sz w:val="17"/>
+              </w:rPr>
+              <w:lastRenderedPageBreak/>
+              <w:t>clearance and thread engagement.</w:t>
             </w:r>
           </w:p>
         </w:tc>
       </w:tr>
       <w:tr>
-        <w:trPr/>
-        <w:tc>
-          <w:tcPr>
-            <w:tcW w:type="dxa" w:w="914"/>
-            <w:vAlign w:val="center"/>
-            <w:shd w:fill="EAF2F8"/>
-            <w:tcMar>
-              <w:top w:w="80" w:type="dxa"/>
-              <w:bottom w:w="80" w:type="dxa"/>
-              <w:start w:w="120" w:type="dxa"/>
-              <w:end w:w="120" w:type="dxa"/>
-            </w:tcMar>
-          </w:tcPr>
-          <w:p>
-            <w:pPr>
-              <w:spacing w:before="0" w:after="40" w:line="240" w:lineRule="auto"/>
-            </w:pPr>
-            <w:r/>
+        <w:tc>
+          <w:tcPr>
+            <w:tcW w:w="914" w:type="dxa"/>
+            <w:shd w:val="clear" w:color="auto" w:fill="EAF2F8"/>
+            <w:tcMar>
+              <w:top w:w="80" w:type="dxa"/>
+              <w:left w:w="120" w:type="dxa"/>
+              <w:bottom w:w="80" w:type="dxa"/>
+              <w:right w:w="120" w:type="dxa"/>
+            </w:tcMar>
+            <w:vAlign w:val="center"/>
+          </w:tcPr>
+          <w:p>
+            <w:pPr>
+              <w:spacing w:after="40" w:line="240" w:lineRule="auto"/>
+            </w:pPr>
             <w:r>
               <w:rPr>
                 <w:rFonts w:ascii="Calibri" w:hAnsi="Calibri"/>
                 <w:b/>
                 <w:sz w:val="17"/>
               </w:rPr>
+              <w:lastRenderedPageBreak/>
               <w:t>REQ-10</w:t>
             </w:r>
           </w:p>
         </w:tc>
         <w:tc>
           <w:tcPr>
-            <w:tcW w:type="dxa" w:w="2409"/>
-            <w:vAlign w:val="center"/>
-            <w:shd w:fill="EAF2F8"/>
-            <w:tcMar>
-              <w:top w:w="80" w:type="dxa"/>
-              <w:bottom w:w="80" w:type="dxa"/>
-              <w:start w:w="120" w:type="dxa"/>
-              <w:end w:w="120" w:type="dxa"/>
-            </w:tcMar>
-          </w:tcPr>
-          <w:p>
-            <w:pPr>
-              <w:spacing w:before="0" w:after="40" w:line="240" w:lineRule="auto"/>
-            </w:pPr>
-            <w:r/>
-            <w:r>
-              <w:rPr>
-                <w:rFonts w:ascii="Calibri" w:hAnsi="Calibri"/>
-                <w:b w:val="0"/>
+            <w:tcW w:w="2409" w:type="dxa"/>
+            <w:shd w:val="clear" w:color="auto" w:fill="EAF2F8"/>
+            <w:tcMar>
+              <w:top w:w="80" w:type="dxa"/>
+              <w:left w:w="120" w:type="dxa"/>
+              <w:bottom w:w="80" w:type="dxa"/>
+              <w:right w:w="120" w:type="dxa"/>
+            </w:tcMar>
+            <w:vAlign w:val="center"/>
+          </w:tcPr>
+          <w:p>
+            <w:pPr>
+              <w:spacing w:after="40" w:line="240" w:lineRule="auto"/>
+            </w:pPr>
+            <w:r>
+              <w:rPr>
+                <w:rFonts w:ascii="Calibri" w:hAnsi="Calibri"/>
                 <w:sz w:val="17"/>
               </w:rPr>
               <w:t>The mount shall provide attachment points for connection to an external base.</w:t>
@@ -1268,25 +1205,23 @@
         </w:tc>
         <w:tc>
           <w:tcPr>
-            <w:tcW w:type="dxa" w:w="2575"/>
-            <w:vAlign w:val="center"/>
-            <w:shd w:fill="EAF2F8"/>
-            <w:tcMar>
-              <w:top w:w="80" w:type="dxa"/>
-              <w:bottom w:w="80" w:type="dxa"/>
-              <w:start w:w="120" w:type="dxa"/>
-              <w:end w:w="120" w:type="dxa"/>
-            </w:tcMar>
-          </w:tcPr>
-          <w:p>
-            <w:pPr>
-              <w:spacing w:before="0" w:after="40" w:line="240" w:lineRule="auto"/>
-            </w:pPr>
-            <w:r/>
-            <w:r>
-              <w:rPr>
-                <w:rFonts w:ascii="Calibri" w:hAnsi="Calibri"/>
-                <w:b w:val="0"/>
+            <w:tcW w:w="2575" w:type="dxa"/>
+            <w:shd w:val="clear" w:color="auto" w:fill="EAF2F8"/>
+            <w:tcMar>
+              <w:top w:w="80" w:type="dxa"/>
+              <w:left w:w="120" w:type="dxa"/>
+              <w:bottom w:w="80" w:type="dxa"/>
+              <w:right w:w="120" w:type="dxa"/>
+            </w:tcMar>
+            <w:vAlign w:val="center"/>
+          </w:tcPr>
+          <w:p>
+            <w:pPr>
+              <w:spacing w:after="40" w:line="240" w:lineRule="auto"/>
+            </w:pPr>
+            <w:r>
+              <w:rPr>
+                <w:rFonts w:ascii="Calibri" w:hAnsi="Calibri"/>
                 <w:sz w:val="17"/>
               </w:rPr>
               <w:t>At least four accessible base-mounting locations sized for the selected standard fasteners.</w:t>
@@ -1295,25 +1230,23 @@
         </w:tc>
         <w:tc>
           <w:tcPr>
-            <w:tcW w:type="dxa" w:w="2408"/>
-            <w:vAlign w:val="center"/>
-            <w:shd w:fill="EAF2F8"/>
-            <w:tcMar>
-              <w:top w:w="80" w:type="dxa"/>
-              <w:bottom w:w="80" w:type="dxa"/>
-              <w:start w:w="120" w:type="dxa"/>
-              <w:end w:w="120" w:type="dxa"/>
-            </w:tcMar>
-          </w:tcPr>
-          <w:p>
-            <w:pPr>
-              <w:spacing w:before="0" w:after="40" w:line="240" w:lineRule="auto"/>
-            </w:pPr>
-            <w:r/>
-            <w:r>
-              <w:rPr>
-                <w:rFonts w:ascii="Calibri" w:hAnsi="Calibri"/>
-                <w:b w:val="0"/>
+            <w:tcW w:w="2408" w:type="dxa"/>
+            <w:shd w:val="clear" w:color="auto" w:fill="EAF2F8"/>
+            <w:tcMar>
+              <w:top w:w="80" w:type="dxa"/>
+              <w:left w:w="120" w:type="dxa"/>
+              <w:bottom w:w="80" w:type="dxa"/>
+              <w:right w:w="120" w:type="dxa"/>
+            </w:tcMar>
+            <w:vAlign w:val="center"/>
+          </w:tcPr>
+          <w:p>
+            <w:pPr>
+              <w:spacing w:after="40" w:line="240" w:lineRule="auto"/>
+            </w:pPr>
+            <w:r>
+              <w:rPr>
+                <w:rFonts w:ascii="Calibri" w:hAnsi="Calibri"/>
                 <w:sz w:val="17"/>
               </w:rPr>
               <w:t>Inspect the base-plate drawing and perform a CAD or physical fit check with the intended support structure.</w:t>
@@ -1322,23 +1255,21 @@
         </w:tc>
       </w:tr>
       <w:tr>
-        <w:trPr/>
-        <w:tc>
-          <w:tcPr>
-            <w:tcW w:type="dxa" w:w="914"/>
-            <w:vAlign w:val="center"/>
-            <w:tcMar>
-              <w:top w:w="80" w:type="dxa"/>
-              <w:bottom w:w="80" w:type="dxa"/>
-              <w:start w:w="120" w:type="dxa"/>
-              <w:end w:w="120" w:type="dxa"/>
-            </w:tcMar>
-          </w:tcPr>
-          <w:p>
-            <w:pPr>
-              <w:spacing w:before="0" w:after="40" w:line="240" w:lineRule="auto"/>
-            </w:pPr>
-            <w:r/>
+        <w:tc>
+          <w:tcPr>
+            <w:tcW w:w="914" w:type="dxa"/>
+            <w:tcMar>
+              <w:top w:w="80" w:type="dxa"/>
+              <w:left w:w="120" w:type="dxa"/>
+              <w:bottom w:w="80" w:type="dxa"/>
+              <w:right w:w="120" w:type="dxa"/>
+            </w:tcMar>
+            <w:vAlign w:val="center"/>
+          </w:tcPr>
+          <w:p>
+            <w:pPr>
+              <w:spacing w:after="40" w:line="240" w:lineRule="auto"/>
+            </w:pPr>
             <w:r>
               <w:rPr>
                 <w:rFonts w:ascii="Calibri" w:hAnsi="Calibri"/>
@@ -1351,24 +1282,22 @@
         </w:tc>
         <w:tc>
           <w:tcPr>
-            <w:tcW w:type="dxa" w:w="2409"/>
-            <w:vAlign w:val="center"/>
-            <w:tcMar>
-              <w:top w:w="80" w:type="dxa"/>
-              <w:bottom w:w="80" w:type="dxa"/>
-              <w:start w:w="120" w:type="dxa"/>
-              <w:end w:w="120" w:type="dxa"/>
-            </w:tcMar>
-          </w:tcPr>
-          <w:p>
-            <w:pPr>
-              <w:spacing w:before="0" w:after="40" w:line="240" w:lineRule="auto"/>
-            </w:pPr>
-            <w:r/>
-            <w:r>
-              <w:rPr>
-                <w:rFonts w:ascii="Calibri" w:hAnsi="Calibri"/>
-                <w:b w:val="0"/>
+            <w:tcW w:w="2409" w:type="dxa"/>
+            <w:tcMar>
+              <w:top w:w="80" w:type="dxa"/>
+              <w:left w:w="120" w:type="dxa"/>
+              <w:bottom w:w="80" w:type="dxa"/>
+              <w:right w:w="120" w:type="dxa"/>
+            </w:tcMar>
+            <w:vAlign w:val="center"/>
+          </w:tcPr>
+          <w:p>
+            <w:pPr>
+              <w:spacing w:after="40" w:line="240" w:lineRule="auto"/>
+            </w:pPr>
+            <w:r>
+              <w:rPr>
+                <w:rFonts w:ascii="Calibri" w:hAnsi="Calibri"/>
                 <w:sz w:val="17"/>
               </w:rPr>
               <w:t>The custom plates shall be practical to manufacture using basic workshop processes.</w:t>
@@ -1377,24 +1306,22 @@
         </w:tc>
         <w:tc>
           <w:tcPr>
-            <w:tcW w:type="dxa" w:w="2575"/>
-            <w:vAlign w:val="center"/>
-            <w:tcMar>
-              <w:top w:w="80" w:type="dxa"/>
-              <w:bottom w:w="80" w:type="dxa"/>
-              <w:start w:w="120" w:type="dxa"/>
-              <w:end w:w="120" w:type="dxa"/>
-            </w:tcMar>
-          </w:tcPr>
-          <w:p>
-            <w:pPr>
-              <w:spacing w:before="0" w:after="40" w:line="240" w:lineRule="auto"/>
-            </w:pPr>
-            <w:r/>
-            <w:r>
-              <w:rPr>
-                <w:rFonts w:ascii="Calibri" w:hAnsi="Calibri"/>
-                <w:b w:val="0"/>
+            <w:tcW w:w="2575" w:type="dxa"/>
+            <w:tcMar>
+              <w:top w:w="80" w:type="dxa"/>
+              <w:left w:w="120" w:type="dxa"/>
+              <w:bottom w:w="80" w:type="dxa"/>
+              <w:right w:w="120" w:type="dxa"/>
+            </w:tcMar>
+            <w:vAlign w:val="center"/>
+          </w:tcPr>
+          <w:p>
+            <w:pPr>
+              <w:spacing w:after="40" w:line="240" w:lineRule="auto"/>
+            </w:pPr>
+            <w:r>
+              <w:rPr>
+                <w:rFonts w:ascii="Calibri" w:hAnsi="Calibri"/>
                 <w:sz w:val="17"/>
               </w:rPr>
               <w:t>Flat-plate construction using conventional cutting, drilling, and slot-machining operations; specialized processes must be documented if required.</w:t>
@@ -1403,24 +1330,22 @@
         </w:tc>
         <w:tc>
           <w:tcPr>
-            <w:tcW w:type="dxa" w:w="2408"/>
-            <w:vAlign w:val="center"/>
-            <w:tcMar>
-              <w:top w:w="80" w:type="dxa"/>
-              <w:bottom w:w="80" w:type="dxa"/>
-              <w:start w:w="120" w:type="dxa"/>
-              <w:end w:w="120" w:type="dxa"/>
-            </w:tcMar>
-          </w:tcPr>
-          <w:p>
-            <w:pPr>
-              <w:spacing w:before="0" w:after="40" w:line="240" w:lineRule="auto"/>
-            </w:pPr>
-            <w:r/>
-            <w:r>
-              <w:rPr>
-                <w:rFonts w:ascii="Calibri" w:hAnsi="Calibri"/>
-                <w:b w:val="0"/>
+            <w:tcW w:w="2408" w:type="dxa"/>
+            <w:tcMar>
+              <w:top w:w="80" w:type="dxa"/>
+              <w:left w:w="120" w:type="dxa"/>
+              <w:bottom w:w="80" w:type="dxa"/>
+              <w:right w:w="120" w:type="dxa"/>
+            </w:tcMar>
+            <w:vAlign w:val="center"/>
+          </w:tcPr>
+          <w:p>
+            <w:pPr>
+              <w:spacing w:after="40" w:line="240" w:lineRule="auto"/>
+            </w:pPr>
+            <w:r>
+              <w:rPr>
+                <w:rFonts w:ascii="Calibri" w:hAnsi="Calibri"/>
                 <w:sz w:val="17"/>
               </w:rPr>
               <w:t>Conduct a manufacturing review of the final part drawings.</w:t>
@@ -1429,24 +1354,22 @@
         </w:tc>
       </w:tr>
       <w:tr>
-        <w:trPr/>
-        <w:tc>
-          <w:tcPr>
-            <w:tcW w:type="dxa" w:w="914"/>
-            <w:vAlign w:val="center"/>
-            <w:shd w:fill="EAF2F8"/>
-            <w:tcMar>
-              <w:top w:w="80" w:type="dxa"/>
-              <w:bottom w:w="80" w:type="dxa"/>
-              <w:start w:w="120" w:type="dxa"/>
-              <w:end w:w="120" w:type="dxa"/>
-            </w:tcMar>
-          </w:tcPr>
-          <w:p>
-            <w:pPr>
-              <w:spacing w:before="0" w:after="40" w:line="240" w:lineRule="auto"/>
-            </w:pPr>
-            <w:r/>
+        <w:tc>
+          <w:tcPr>
+            <w:tcW w:w="914" w:type="dxa"/>
+            <w:shd w:val="clear" w:color="auto" w:fill="EAF2F8"/>
+            <w:tcMar>
+              <w:top w:w="80" w:type="dxa"/>
+              <w:left w:w="120" w:type="dxa"/>
+              <w:bottom w:w="80" w:type="dxa"/>
+              <w:right w:w="120" w:type="dxa"/>
+            </w:tcMar>
+            <w:vAlign w:val="center"/>
+          </w:tcPr>
+          <w:p>
+            <w:pPr>
+              <w:spacing w:after="40" w:line="240" w:lineRule="auto"/>
+            </w:pPr>
             <w:r>
               <w:rPr>
                 <w:rFonts w:ascii="Calibri" w:hAnsi="Calibri"/>
@@ -1459,25 +1382,23 @@
         </w:tc>
         <w:tc>
           <w:tcPr>
-            <w:tcW w:type="dxa" w:w="2409"/>
-            <w:vAlign w:val="center"/>
-            <w:shd w:fill="EAF2F8"/>
-            <w:tcMar>
-              <w:top w:w="80" w:type="dxa"/>
-              <w:bottom w:w="80" w:type="dxa"/>
-              <w:start w:w="120" w:type="dxa"/>
-              <w:end w:w="120" w:type="dxa"/>
-            </w:tcMar>
-          </w:tcPr>
-          <w:p>
-            <w:pPr>
-              <w:spacing w:before="0" w:after="40" w:line="240" w:lineRule="auto"/>
-            </w:pPr>
-            <w:r/>
-            <w:r>
-              <w:rPr>
-                <w:rFonts w:ascii="Calibri" w:hAnsi="Calibri"/>
-                <w:b w:val="0"/>
+            <w:tcW w:w="2409" w:type="dxa"/>
+            <w:shd w:val="clear" w:color="auto" w:fill="EAF2F8"/>
+            <w:tcMar>
+              <w:top w:w="80" w:type="dxa"/>
+              <w:left w:w="120" w:type="dxa"/>
+              <w:bottom w:w="80" w:type="dxa"/>
+              <w:right w:w="120" w:type="dxa"/>
+            </w:tcMar>
+            <w:vAlign w:val="center"/>
+          </w:tcPr>
+          <w:p>
+            <w:pPr>
+              <w:spacing w:after="40" w:line="240" w:lineRule="auto"/>
+            </w:pPr>
+            <w:r>
+              <w:rPr>
+                <w:rFonts w:ascii="Calibri" w:hAnsi="Calibri"/>
                 <w:sz w:val="17"/>
               </w:rPr>
               <w:t>Installation and adjustment shall be possible using common hand tools.</w:t>
@@ -1486,25 +1407,23 @@
         </w:tc>
         <w:tc>
           <w:tcPr>
-            <w:tcW w:type="dxa" w:w="2575"/>
-            <w:vAlign w:val="center"/>
-            <w:shd w:fill="EAF2F8"/>
-            <w:tcMar>
-              <w:top w:w="80" w:type="dxa"/>
-              <w:bottom w:w="80" w:type="dxa"/>
-              <w:start w:w="120" w:type="dxa"/>
-              <w:end w:w="120" w:type="dxa"/>
-            </w:tcMar>
-          </w:tcPr>
-          <w:p>
-            <w:pPr>
-              <w:spacing w:before="0" w:after="40" w:line="240" w:lineRule="auto"/>
-            </w:pPr>
-            <w:r/>
-            <w:r>
-              <w:rPr>
-                <w:rFonts w:ascii="Calibri" w:hAnsi="Calibri"/>
-                <w:b w:val="0"/>
+            <w:tcW w:w="2575" w:type="dxa"/>
+            <w:shd w:val="clear" w:color="auto" w:fill="EAF2F8"/>
+            <w:tcMar>
+              <w:top w:w="80" w:type="dxa"/>
+              <w:left w:w="120" w:type="dxa"/>
+              <w:bottom w:w="80" w:type="dxa"/>
+              <w:right w:w="120" w:type="dxa"/>
+            </w:tcMar>
+            <w:vAlign w:val="center"/>
+          </w:tcPr>
+          <w:p>
+            <w:pPr>
+              <w:spacing w:after="40" w:line="240" w:lineRule="auto"/>
+            </w:pPr>
+            <w:r>
+              <w:rPr>
+                <w:rFonts w:ascii="Calibri" w:hAnsi="Calibri"/>
                 <w:sz w:val="17"/>
               </w:rPr>
               <w:t>All required fasteners accessible with standard hex keys or wrenches; motor position adjustable without removing the motor from its plate.</w:t>
@@ -1513,25 +1432,23 @@
         </w:tc>
         <w:tc>
           <w:tcPr>
-            <w:tcW w:type="dxa" w:w="2408"/>
-            <w:vAlign w:val="center"/>
-            <w:shd w:fill="EAF2F8"/>
-            <w:tcMar>
-              <w:top w:w="80" w:type="dxa"/>
-              <w:bottom w:w="80" w:type="dxa"/>
-              <w:start w:w="120" w:type="dxa"/>
-              <w:end w:w="120" w:type="dxa"/>
-            </w:tcMar>
-          </w:tcPr>
-          <w:p>
-            <w:pPr>
-              <w:spacing w:before="0" w:after="40" w:line="240" w:lineRule="auto"/>
-            </w:pPr>
-            <w:r/>
-            <w:r>
-              <w:rPr>
-                <w:rFonts w:ascii="Calibri" w:hAnsi="Calibri"/>
-                <w:b w:val="0"/>
+            <w:tcW w:w="2408" w:type="dxa"/>
+            <w:shd w:val="clear" w:color="auto" w:fill="EAF2F8"/>
+            <w:tcMar>
+              <w:top w:w="80" w:type="dxa"/>
+              <w:left w:w="120" w:type="dxa"/>
+              <w:bottom w:w="80" w:type="dxa"/>
+              <w:right w:w="120" w:type="dxa"/>
+            </w:tcMar>
+            <w:vAlign w:val="center"/>
+          </w:tcPr>
+          <w:p>
+            <w:pPr>
+              <w:spacing w:after="40" w:line="240" w:lineRule="auto"/>
+            </w:pPr>
+            <w:r>
+              <w:rPr>
+                <w:rFonts w:ascii="Calibri" w:hAnsi="Calibri"/>
                 <w:sz w:val="17"/>
               </w:rPr>
               <w:t>Conduct an assembly and adjustment demonstration.</w:t>
@@ -1540,23 +1457,21 @@
         </w:tc>
       </w:tr>
       <w:tr>
-        <w:trPr/>
-        <w:tc>
-          <w:tcPr>
-            <w:tcW w:type="dxa" w:w="914"/>
-            <w:vAlign w:val="center"/>
-            <w:tcMar>
-              <w:top w:w="80" w:type="dxa"/>
-              <w:bottom w:w="80" w:type="dxa"/>
-              <w:start w:w="120" w:type="dxa"/>
-              <w:end w:w="120" w:type="dxa"/>
-            </w:tcMar>
-          </w:tcPr>
-          <w:p>
-            <w:pPr>
-              <w:spacing w:before="0" w:after="40" w:line="240" w:lineRule="auto"/>
-            </w:pPr>
-            <w:r/>
+        <w:tc>
+          <w:tcPr>
+            <w:tcW w:w="914" w:type="dxa"/>
+            <w:tcMar>
+              <w:top w:w="80" w:type="dxa"/>
+              <w:left w:w="120" w:type="dxa"/>
+              <w:bottom w:w="80" w:type="dxa"/>
+              <w:right w:w="120" w:type="dxa"/>
+            </w:tcMar>
+            <w:vAlign w:val="center"/>
+          </w:tcPr>
+          <w:p>
+            <w:pPr>
+              <w:spacing w:after="40" w:line="240" w:lineRule="auto"/>
+            </w:pPr>
             <w:r>
               <w:rPr>
                 <w:rFonts w:ascii="Calibri" w:hAnsi="Calibri"/>
@@ -1569,24 +1484,22 @@
         </w:tc>
         <w:tc>
           <w:tcPr>
-            <w:tcW w:type="dxa" w:w="2409"/>
-            <w:vAlign w:val="center"/>
-            <w:tcMar>
-              <w:top w:w="80" w:type="dxa"/>
-              <w:bottom w:w="80" w:type="dxa"/>
-              <w:start w:w="120" w:type="dxa"/>
-              <w:end w:w="120" w:type="dxa"/>
-            </w:tcMar>
-          </w:tcPr>
-          <w:p>
-            <w:pPr>
-              <w:spacing w:before="0" w:after="40" w:line="240" w:lineRule="auto"/>
-            </w:pPr>
-            <w:r/>
-            <w:r>
-              <w:rPr>
-                <w:rFonts w:ascii="Calibri" w:hAnsi="Calibri"/>
-                <w:b w:val="0"/>
+            <w:tcW w:w="2409" w:type="dxa"/>
+            <w:tcMar>
+              <w:top w:w="80" w:type="dxa"/>
+              <w:left w:w="120" w:type="dxa"/>
+              <w:bottom w:w="80" w:type="dxa"/>
+              <w:right w:w="120" w:type="dxa"/>
+            </w:tcMar>
+            <w:vAlign w:val="center"/>
+          </w:tcPr>
+          <w:p>
+            <w:pPr>
+              <w:spacing w:after="40" w:line="240" w:lineRule="auto"/>
+            </w:pPr>
+            <w:r>
+              <w:rPr>
+                <w:rFonts w:ascii="Calibri" w:hAnsi="Calibri"/>
                 <w:sz w:val="17"/>
               </w:rPr>
               <w:t>The released design shall have a minimum manufacturing and assembly drawing package.</w:t>
@@ -1595,24 +1508,22 @@
         </w:tc>
         <w:tc>
           <w:tcPr>
-            <w:tcW w:type="dxa" w:w="2575"/>
-            <w:vAlign w:val="center"/>
-            <w:tcMar>
-              <w:top w:w="80" w:type="dxa"/>
-              <w:bottom w:w="80" w:type="dxa"/>
-              <w:start w:w="120" w:type="dxa"/>
-              <w:end w:w="120" w:type="dxa"/>
-            </w:tcMar>
-          </w:tcPr>
-          <w:p>
-            <w:pPr>
-              <w:spacing w:before="0" w:after="40" w:line="240" w:lineRule="auto"/>
-            </w:pPr>
-            <w:r/>
-            <w:r>
-              <w:rPr>
-                <w:rFonts w:ascii="Calibri" w:hAnsi="Calibri"/>
-                <w:b w:val="0"/>
+            <w:tcW w:w="2575" w:type="dxa"/>
+            <w:tcMar>
+              <w:top w:w="80" w:type="dxa"/>
+              <w:left w:w="120" w:type="dxa"/>
+              <w:bottom w:w="80" w:type="dxa"/>
+              <w:right w:w="120" w:type="dxa"/>
+            </w:tcMar>
+            <w:vAlign w:val="center"/>
+          </w:tcPr>
+          <w:p>
+            <w:pPr>
+              <w:spacing w:after="40" w:line="240" w:lineRule="auto"/>
+            </w:pPr>
+            <w:r>
+              <w:rPr>
+                <w:rFonts w:ascii="Calibri" w:hAnsi="Calibri"/>
                 <w:sz w:val="17"/>
               </w:rPr>
               <w:t>Required drawing-package content: dimensioned drawings for the motor plate and base plate, plus an assembly drawing showing units, materials, general tolerances, fasteners, and adjustment direction.</w:t>
@@ -1621,24 +1532,22 @@
         </w:tc>
         <w:tc>
           <w:tcPr>
-            <w:tcW w:type="dxa" w:w="2408"/>
-            <w:vAlign w:val="center"/>
-            <w:tcMar>
-              <w:top w:w="80" w:type="dxa"/>
-              <w:bottom w:w="80" w:type="dxa"/>
-              <w:start w:w="120" w:type="dxa"/>
-              <w:end w:w="120" w:type="dxa"/>
-            </w:tcMar>
-          </w:tcPr>
-          <w:p>
-            <w:pPr>
-              <w:spacing w:before="0" w:after="40" w:line="240" w:lineRule="auto"/>
-            </w:pPr>
-            <w:r/>
-            <w:r>
-              <w:rPr>
-                <w:rFonts w:ascii="Calibri" w:hAnsi="Calibri"/>
-                <w:b w:val="0"/>
+            <w:tcW w:w="2408" w:type="dxa"/>
+            <w:tcMar>
+              <w:top w:w="80" w:type="dxa"/>
+              <w:left w:w="120" w:type="dxa"/>
+              <w:bottom w:w="80" w:type="dxa"/>
+              <w:right w:w="120" w:type="dxa"/>
+            </w:tcMar>
+            <w:vAlign w:val="center"/>
+          </w:tcPr>
+          <w:p>
+            <w:pPr>
+              <w:spacing w:after="40" w:line="240" w:lineRule="auto"/>
+            </w:pPr>
+            <w:r>
+              <w:rPr>
+                <w:rFonts w:ascii="Calibri" w:hAnsi="Calibri"/>
                 <w:sz w:val="17"/>
               </w:rPr>
               <w:t>Review the completed drawing package against a release checklist.</w:t>
@@ -1657,6 +1566,8 @@
       </w:pPr>
       <w:r>
         <w:t>Selected Motor:</w:t>
+      </w:r>
+      <w:r>
         <w:br/>
         <w:t>Simplified NEMA 17-style CAD representation</w:t>
       </w:r>
@@ -1826,6 +1737,7 @@
         <w:rPr>
           <w:rFonts w:ascii="David" w:hAnsi="David" w:cs="David"/>
         </w:rPr>
+        <w:lastRenderedPageBreak/>
         <w:t xml:space="preserve">Standard fasteners will be used where possible </w:t>
       </w:r>
     </w:p>
@@ -3248,6 +3160,7 @@
   <w:style w:type="character" w:default="1" w:styleId="a0">
     <w:name w:val="Default Paragraph Font"/>
     <w:uiPriority w:val="1"/>
+    <w:semiHidden/>
     <w:unhideWhenUsed/>
   </w:style>
   <w:style w:type="table" w:default="1" w:styleId="a1">

</xml_diff>